<commit_message>
Lab 2 - Update document
Lab 2 - Update document
</commit_message>
<xml_diff>
--- a/Assigment/Lab2/Lab2_Phuong Nguyen.docx
+++ b/Assigment/Lab2/Lab2_Phuong Nguyen.docx
@@ -668,7 +668,7 @@
     <w:pPr>
       <w:pStyle w:val="Header"/>
       <w:rPr>
-        <w:lang w:val="vi-VN"/>
+        <w:lang w:val="en-US"/>
       </w:rPr>
     </w:pPr>
     <w:r>
@@ -687,7 +687,13 @@
       <w:rPr>
         <w:lang w:val="vi-VN"/>
       </w:rPr>
-      <w:t>Assignment: Lab 1</w:t>
+      <w:t xml:space="preserve">Assignment: Lab </w:t>
+    </w:r>
+    <w:r>
+      <w:rPr>
+        <w:lang w:val="en-US"/>
+      </w:rPr>
+      <w:t>2</w:t>
     </w:r>
   </w:p>
   <w:p>

</xml_diff>